<commit_message>
Added links for new sound sensor info
</commit_message>
<xml_diff>
--- a/Resources.docx
+++ b/Resources.docx
@@ -133,6 +133,9 @@
     </w:p>
     <w:p>
       <w:r>
+        <w:rPr>
+          <w:noProof/>
+        </w:rPr>
         <w:drawing>
           <wp:inline distT="0" distB="0" distL="0" distR="0" wp14:anchorId="5EDB3BA9" wp14:editId="6F9EDA60">
             <wp:extent cx="5731510" cy="2624455"/>
@@ -169,6 +172,35 @@
           </wp:inline>
         </w:drawing>
       </w:r>
+    </w:p>
+    <w:p/>
+    <w:p>
+      <w:r>
+        <w:t>New Sound Sensor INMP 441</w:t>
+      </w:r>
+      <w:r>
+        <w:t>:</w:t>
+      </w:r>
+    </w:p>
+    <w:p>
+      <w:hyperlink r:id="rId13" w:history="1">
+        <w:r>
+          <w:rPr>
+            <w:rStyle w:val="Hyperlink"/>
+          </w:rPr>
+          <w:t>Datasheet</w:t>
+        </w:r>
+      </w:hyperlink>
+    </w:p>
+    <w:p>
+      <w:hyperlink r:id="rId14" w:history="1">
+        <w:r>
+          <w:rPr>
+            <w:rStyle w:val="Hyperlink"/>
+          </w:rPr>
+          <w:t>Tutorial for INMP 441</w:t>
+        </w:r>
+      </w:hyperlink>
     </w:p>
     <w:sectPr>
       <w:pgSz w:w="11906" w:h="16838"/>

</xml_diff>

<commit_message>
Added more resources for sound sensor
</commit_message>
<xml_diff>
--- a/Resources.docx
+++ b/Resources.docx
@@ -201,6 +201,51 @@
           <w:t>Tutorial for INMP 441</w:t>
         </w:r>
       </w:hyperlink>
+    </w:p>
+    <w:p/>
+    <w:p>
+      <w:r>
+        <w:t>Decoupling (?)</w:t>
+      </w:r>
+    </w:p>
+    <w:p>
+      <w:r>
+        <w:drawing>
+          <wp:inline distT="0" distB="0" distL="0" distR="0" wp14:anchorId="406BC57C" wp14:editId="6314BBEB">
+            <wp:extent cx="2743200" cy="3195758"/>
+            <wp:effectExtent l="0" t="0" r="0" b="5080"/>
+            <wp:docPr id="105914015" name="Picture 1" descr="Decoupling circuit example&#10;"/>
+            <wp:cNvGraphicFramePr>
+              <a:graphicFrameLocks xmlns:a="http://schemas.openxmlformats.org/drawingml/2006/main" noChangeAspect="1"/>
+            </wp:cNvGraphicFramePr>
+            <a:graphic xmlns:a="http://schemas.openxmlformats.org/drawingml/2006/main">
+              <a:graphicData uri="http://schemas.openxmlformats.org/drawingml/2006/picture">
+                <pic:pic xmlns:pic="http://schemas.openxmlformats.org/drawingml/2006/picture">
+                  <pic:nvPicPr>
+                    <pic:cNvPr id="105914015" name="Picture 1" descr="Decoupling circuit example&#10;"/>
+                    <pic:cNvPicPr/>
+                  </pic:nvPicPr>
+                  <pic:blipFill>
+                    <a:blip r:embed="rId15"/>
+                    <a:stretch>
+                      <a:fillRect/>
+                    </a:stretch>
+                  </pic:blipFill>
+                  <pic:spPr>
+                    <a:xfrm>
+                      <a:off x="0" y="0"/>
+                      <a:ext cx="2747470" cy="3200733"/>
+                    </a:xfrm>
+                    <a:prstGeom prst="rect">
+                      <a:avLst/>
+                    </a:prstGeom>
+                  </pic:spPr>
+                </pic:pic>
+              </a:graphicData>
+            </a:graphic>
+          </wp:inline>
+        </w:drawing>
+      </w:r>
     </w:p>
     <w:sectPr>
       <w:pgSz w:w="11906" w:h="16838"/>

</xml_diff>

<commit_message>
Code up to date and verified, but have a corrupt flash config issue
</commit_message>
<xml_diff>
--- a/Resources.docx
+++ b/Resources.docx
@@ -15,6 +15,9 @@
     <w:p/>
     <w:p/>
     <w:p>
+      <w:r>
+        <w:t>~~</w:t>
+      </w:r>
       <w:hyperlink r:id="rId6" w:history="1">
         <w:r>
           <w:rPr>
@@ -23,6 +26,9 @@
           <w:t>Sound Sensor Info</w:t>
         </w:r>
       </w:hyperlink>
+      <w:r>
+        <w:t>~~ No longer using this sensor</w:t>
+      </w:r>
     </w:p>
     <w:p/>
     <w:p/>
@@ -210,6 +216,9 @@
     </w:p>
     <w:p>
       <w:r>
+        <w:rPr>
+          <w:noProof/>
+        </w:rPr>
         <w:drawing>
           <wp:inline distT="0" distB="0" distL="0" distR="0" wp14:anchorId="406BC57C" wp14:editId="6314BBEB">
             <wp:extent cx="2743200" cy="3195758"/>

</xml_diff>

<commit_message>
Finished main code loop
</commit_message>
<xml_diff>
--- a/Resources.docx
+++ b/Resources.docx
@@ -244,6 +244,63 @@
                     <a:xfrm>
                       <a:off x="0" y="0"/>
                       <a:ext cx="2747470" cy="3200733"/>
+                    </a:xfrm>
+                    <a:prstGeom prst="rect">
+                      <a:avLst/>
+                    </a:prstGeom>
+                  </pic:spPr>
+                </pic:pic>
+              </a:graphicData>
+            </a:graphic>
+          </wp:inline>
+        </w:drawing>
+      </w:r>
+    </w:p>
+    <w:p/>
+    <w:p/>
+    <w:p>
+      <w:r>
+        <w:lastRenderedPageBreak/>
+        <w:t>Temperature Values</w:t>
+      </w:r>
+    </w:p>
+    <w:p>
+      <w:hyperlink r:id="rId16" w:anchor=":~:text=An%20acceptable%20temperature%20for%20office,required%20based%20on%20risk%20assessments." w:history="1">
+        <w:r>
+          <w:rPr>
+            <w:rStyle w:val="Hyperlink"/>
+          </w:rPr>
+          <w:t>HSE Temperature guidelines</w:t>
+        </w:r>
+      </w:hyperlink>
+    </w:p>
+    <w:p>
+      <w:r>
+        <w:drawing>
+          <wp:inline distT="0" distB="0" distL="0" distR="0" wp14:anchorId="5E3720A4" wp14:editId="198F01A4">
+            <wp:extent cx="5731510" cy="3257550"/>
+            <wp:effectExtent l="0" t="0" r="2540" b="0"/>
+            <wp:docPr id="1580692091" name="Picture 1"/>
+            <wp:cNvGraphicFramePr>
+              <a:graphicFrameLocks xmlns:a="http://schemas.openxmlformats.org/drawingml/2006/main" noChangeAspect="1"/>
+            </wp:cNvGraphicFramePr>
+            <a:graphic xmlns:a="http://schemas.openxmlformats.org/drawingml/2006/main">
+              <a:graphicData uri="http://schemas.openxmlformats.org/drawingml/2006/picture">
+                <pic:pic xmlns:pic="http://schemas.openxmlformats.org/drawingml/2006/picture">
+                  <pic:nvPicPr>
+                    <pic:cNvPr id="1580692091" name=""/>
+                    <pic:cNvPicPr/>
+                  </pic:nvPicPr>
+                  <pic:blipFill>
+                    <a:blip r:embed="rId17"/>
+                    <a:stretch>
+                      <a:fillRect/>
+                    </a:stretch>
+                  </pic:blipFill>
+                  <pic:spPr>
+                    <a:xfrm>
+                      <a:off x="0" y="0"/>
+                      <a:ext cx="5731510" cy="3257550"/>
                     </a:xfrm>
                     <a:prstGeom prst="rect">
                       <a:avLst/>

</xml_diff>

<commit_message>
Added for demonstration, working on sound sensor demo now
</commit_message>
<xml_diff>
--- a/Resources.docx
+++ b/Resources.docx
@@ -3,14 +3,24 @@
 <w:document xmlns:wpc="http://schemas.microsoft.com/office/word/2010/wordprocessingCanvas" xmlns:cx="http://schemas.microsoft.com/office/drawing/2014/chartex" xmlns:cx1="http://schemas.microsoft.com/office/drawing/2015/9/8/chartex" xmlns:cx2="http://schemas.microsoft.com/office/drawing/2015/10/21/chartex" xmlns:cx3="http://schemas.microsoft.com/office/drawing/2016/5/9/chartex" xmlns:cx4="http://schemas.microsoft.com/office/drawing/2016/5/10/chartex" xmlns:cx5="http://schemas.microsoft.com/office/drawing/2016/5/11/chartex" xmlns:cx6="http://schemas.microsoft.com/office/drawing/2016/5/12/chartex" xmlns:cx7="http://schemas.microsoft.com/office/drawing/2016/5/13/chartex" xmlns:cx8="http://schemas.microsoft.com/office/drawing/2016/5/14/chartex" xmlns:mc="http://schemas.openxmlformats.org/markup-compatibility/2006" xmlns:aink="http://schemas.microsoft.com/office/drawing/2016/ink" xmlns:am3d="http://schemas.microsoft.com/office/drawing/2017/model3d" xmlns:o="urn:schemas-microsoft-com:office:office" xmlns:oel="http://schemas.microsoft.com/office/2019/extlst" xmlns:r="http://schemas.openxmlformats.org/officeDocument/2006/relationships" xmlns:m="http://schemas.openxmlformats.org/officeDocument/2006/math" xmlns:v="urn:schemas-microsoft-com:vml" xmlns:wp14="http://schemas.microsoft.com/office/word/2010/wordprocessingDrawing" xmlns:wp="http://schemas.openxmlformats.org/drawingml/2006/wordprocessingDrawing" xmlns:w10="urn:schemas-microsoft-com:office:word" xmlns:w="http://schemas.openxmlformats.org/wordprocessingml/2006/main" xmlns:w14="http://schemas.microsoft.com/office/word/2010/wordml" xmlns:w15="http://schemas.microsoft.com/office/word/2012/wordml" xmlns:w16cex="http://schemas.microsoft.com/office/word/2018/wordml/cex" xmlns:w16cid="http://schemas.microsoft.com/office/word/2016/wordml/cid" xmlns:w16="http://schemas.microsoft.com/office/word/2018/wordml" xmlns:w16du="http://schemas.microsoft.com/office/word/2023/wordml/word16du" xmlns:w16sdtdh="http://schemas.microsoft.com/office/word/2020/wordml/sdtdatahash" xmlns:w16sdtfl="http://schemas.microsoft.com/office/word/2024/wordml/sdtformatlock" xmlns:w16se="http://schemas.microsoft.com/office/word/2015/wordml/symex" xmlns:wpg="http://schemas.microsoft.com/office/word/2010/wordprocessingGroup" xmlns:wpi="http://schemas.microsoft.com/office/word/2010/wordprocessingInk" xmlns:wne="http://schemas.microsoft.com/office/word/2006/wordml" xmlns:wps="http://schemas.microsoft.com/office/word/2010/wordprocessingShape" mc:Ignorable="w14 w15 w16se w16cid w16 w16cex w16sdtdh w16sdtfl w16du wp14">
   <w:body>
     <w:p>
-      <w:hyperlink r:id="rId5" w:history="1">
-        <w:r>
-          <w:rPr>
-            <w:rStyle w:val="Hyperlink"/>
-          </w:rPr>
-          <w:t>This Specific ESP32 Pinout and Info</w:t>
-        </w:r>
-      </w:hyperlink>
+      <w:r>
+        <w:fldChar w:fldCharType="begin"/>
+      </w:r>
+      <w:r>
+        <w:instrText>HYPERLINK "https://docs.espressif.com/projects/esp-idf/en/v4.4/esp32/hw-reference/esp32/get-started-devkitc.html"</w:instrText>
+      </w:r>
+      <w:r>
+        <w:fldChar w:fldCharType="separate"/>
+      </w:r>
+      <w:r>
+        <w:rPr>
+          <w:rStyle w:val="Hyperlink"/>
+        </w:rPr>
+        <w:t>This Specific ESP32 Pinout and Info</w:t>
+      </w:r>
+      <w:r>
+        <w:fldChar w:fldCharType="end"/>
+      </w:r>
     </w:p>
     <w:p/>
     <w:p/>
@@ -18,7 +28,7 @@
       <w:r>
         <w:t>~~</w:t>
       </w:r>
-      <w:hyperlink r:id="rId6" w:history="1">
+      <w:hyperlink r:id="rId5" w:history="1">
         <w:r>
           <w:rPr>
             <w:rStyle w:val="Hyperlink"/>
@@ -33,7 +43,7 @@
     <w:p/>
     <w:p/>
     <w:p>
-      <w:hyperlink r:id="rId7" w:history="1">
+      <w:hyperlink r:id="rId6" w:history="1">
         <w:r>
           <w:rPr>
             <w:rStyle w:val="Hyperlink"/>
@@ -45,7 +55,7 @@
     <w:p/>
     <w:p/>
     <w:p>
-      <w:hyperlink r:id="rId8" w:history="1">
+      <w:hyperlink r:id="rId7" w:history="1">
         <w:r>
           <w:rPr>
             <w:rStyle w:val="Hyperlink"/>
@@ -57,7 +67,7 @@
     <w:p/>
     <w:p/>
     <w:p>
-      <w:hyperlink r:id="rId9" w:history="1">
+      <w:hyperlink r:id="rId8" w:history="1">
         <w:r>
           <w:rPr>
             <w:rStyle w:val="Hyperlink"/>
@@ -67,7 +77,7 @@
       </w:hyperlink>
     </w:p>
     <w:p>
-      <w:hyperlink r:id="rId10" w:history="1">
+      <w:hyperlink r:id="rId9" w:history="1">
         <w:r>
           <w:rPr>
             <w:rStyle w:val="Hyperlink"/>
@@ -99,7 +109,7 @@
                     </pic:cNvPicPr>
                   </pic:nvPicPr>
                   <pic:blipFill>
-                    <a:blip r:embed="rId11">
+                    <a:blip r:embed="rId10">
                       <a:extLst>
                         <a:ext uri="{28A0092B-C50C-407E-A947-70E740481C1C}">
                           <a14:useLocalDpi xmlns:a14="http://schemas.microsoft.com/office/drawing/2010/main" val="0"/>
@@ -134,7 +144,15 @@
     <w:p>
       <w:r>
         <w:lastRenderedPageBreak/>
-        <w:t>Pinout for LCD Screen (SCL,SDA)</w:t>
+        <w:t>Pinout for LCD Screen (</w:t>
+      </w:r>
+      <w:proofErr w:type="gramStart"/>
+      <w:r>
+        <w:t>SCL,SDA</w:t>
+      </w:r>
+      <w:proofErr w:type="gramEnd"/>
+      <w:r>
+        <w:t>)</w:t>
       </w:r>
     </w:p>
     <w:p>
@@ -158,7 +176,7 @@
                     <pic:cNvPicPr/>
                   </pic:nvPicPr>
                   <pic:blipFill>
-                    <a:blip r:embed="rId12"/>
+                    <a:blip r:embed="rId11"/>
                     <a:stretch>
                       <a:fillRect/>
                     </a:stretch>
@@ -189,17 +207,17 @@
       </w:r>
     </w:p>
     <w:p>
-      <w:hyperlink r:id="rId13" w:history="1">
+      <w:hyperlink r:id="rId12" w:history="1">
         <w:r>
           <w:rPr>
             <w:rStyle w:val="Hyperlink"/>
           </w:rPr>
-          <w:t>Datasheet</w:t>
+          <w:t>INMP441 DataSheet</w:t>
         </w:r>
       </w:hyperlink>
     </w:p>
     <w:p>
-      <w:hyperlink r:id="rId14" w:history="1">
+      <w:hyperlink r:id="rId13" w:history="1">
         <w:r>
           <w:rPr>
             <w:rStyle w:val="Hyperlink"/>
@@ -235,7 +253,7 @@
                     <pic:cNvPicPr/>
                   </pic:nvPicPr>
                   <pic:blipFill>
-                    <a:blip r:embed="rId15"/>
+                    <a:blip r:embed="rId14"/>
                     <a:stretch>
                       <a:fillRect/>
                     </a:stretch>
@@ -265,7 +283,7 @@
       </w:r>
     </w:p>
     <w:p>
-      <w:hyperlink r:id="rId16" w:anchor=":~:text=An%20acceptable%20temperature%20for%20office,required%20based%20on%20risk%20assessments." w:history="1">
+      <w:hyperlink r:id="rId15" w:anchor=":~:text=An%20acceptable%20temperature%20for%20office,required%20based%20on%20risk%20assessments." w:history="1">
         <w:r>
           <w:rPr>
             <w:rStyle w:val="Hyperlink"/>
@@ -276,6 +294,9 @@
     </w:p>
     <w:p>
       <w:r>
+        <w:rPr>
+          <w:noProof/>
+        </w:rPr>
         <w:drawing>
           <wp:inline distT="0" distB="0" distL="0" distR="0" wp14:anchorId="5E3720A4" wp14:editId="198F01A4">
             <wp:extent cx="5731510" cy="3257550"/>
@@ -292,7 +313,7 @@
                     <pic:cNvPicPr/>
                   </pic:nvPicPr>
                   <pic:blipFill>
-                    <a:blip r:embed="rId17"/>
+                    <a:blip r:embed="rId16"/>
                     <a:stretch>
                       <a:fillRect/>
                     </a:stretch>

</xml_diff>